<commit_message>
feat: Enhance evaluation logic, unified export mechanisms, and resolve assignment bugs
Added appointmentEffectivity in Step 5 and Newly Promoted / No Appearance evaluations in Step 2. Refactored IER and CAR exports to a centralized utility with multiple export privacy modes. Fixed Step 2-3 progression bug and improved API seeder. Removed unused dead code and database migration scripts.
</commit_message>
<xml_diff>
--- a/rsp-dashboard/public/templates/Assignment Order - Division Office.docx
+++ b/rsp-dashboard/public/templates/Assignment Order - Division Office.docx
@@ -24,7 +24,23 @@
           <w:rFonts w:ascii="Bookman Old Style" w:hAnsi="Bookman Old Style" w:cs="Tahoma"/>
           <w:b/>
         </w:rPr>
-        <w:t>{Assignment_Order_No}</w:t>
+        <w:t>{</w:t>
+      </w:r>
+      <w:proofErr w:type="spellStart"/>
+      <w:r>
+        <w:rPr>
+          <w:rFonts w:ascii="Bookman Old Style" w:hAnsi="Bookman Old Style" w:cs="Tahoma"/>
+          <w:b/>
+        </w:rPr>
+        <w:t>Assignment_Order_No</w:t>
+      </w:r>
+      <w:proofErr w:type="spellEnd"/>
+      <w:r>
+        <w:rPr>
+          <w:rFonts w:ascii="Bookman Old Style" w:hAnsi="Bookman Old Style" w:cs="Tahoma"/>
+          <w:b/>
+        </w:rPr>
+        <w:t>}</w:t>
       </w:r>
       <w:r>
         <w:rPr>
@@ -554,24 +570,6 @@
       <w:pPr>
         <w:pStyle w:val="NoSpacing"/>
         <w:rPr>
-          <w:sz w:val="12"/>
-          <w:szCs w:val="12"/>
-        </w:rPr>
-      </w:pPr>
-    </w:p>
-    <w:p>
-      <w:pPr>
-        <w:pStyle w:val="NoSpacing"/>
-        <w:rPr>
-          <w:sz w:val="12"/>
-          <w:szCs w:val="12"/>
-        </w:rPr>
-      </w:pPr>
-    </w:p>
-    <w:p>
-      <w:pPr>
-        <w:pStyle w:val="NoSpacing"/>
-        <w:rPr>
           <w:rFonts w:ascii="Bookman Old Style" w:hAnsi="Bookman Old Style"/>
           <w:sz w:val="16"/>
           <w:szCs w:val="16"/>
@@ -624,50 +622,110 @@
         <w:pStyle w:val="NoSpacing"/>
         <w:rPr>
           <w:rFonts w:ascii="Bookman Old Style" w:hAnsi="Bookman Old Style"/>
-          <w:sz w:val="12"/>
-          <w:szCs w:val="12"/>
+          <w:sz w:val="16"/>
+          <w:szCs w:val="16"/>
         </w:rPr>
       </w:pPr>
     </w:p>
     <w:p>
       <w:pPr>
         <w:pStyle w:val="NoSpacing"/>
+        <w:ind w:left="720"/>
         <w:rPr>
           <w:rFonts w:ascii="Bookman Old Style" w:hAnsi="Bookman Old Style"/>
-          <w:sz w:val="12"/>
-          <w:szCs w:val="12"/>
-        </w:rPr>
-      </w:pPr>
+          <w:sz w:val="16"/>
+          <w:szCs w:val="16"/>
+        </w:rPr>
+      </w:pPr>
+      <w:r>
+        <w:rPr>
+          <w:rFonts w:ascii="Bookman Old Style" w:hAnsi="Bookman Old Style"/>
+          <w:sz w:val="16"/>
+          <w:szCs w:val="16"/>
+        </w:rPr>
+        <w:t>{CC_3}</w:t>
+      </w:r>
     </w:p>
     <w:p>
       <w:pPr>
         <w:pStyle w:val="NoSpacing"/>
         <w:rPr>
           <w:rFonts w:ascii="Bookman Old Style" w:hAnsi="Bookman Old Style"/>
-          <w:sz w:val="12"/>
-          <w:szCs w:val="12"/>
-        </w:rPr>
-      </w:pPr>
+          <w:sz w:val="16"/>
+          <w:szCs w:val="16"/>
+        </w:rPr>
+      </w:pPr>
+      <w:r>
+        <w:rPr>
+          <w:rFonts w:ascii="Bookman Old Style" w:hAnsi="Bookman Old Style"/>
+          <w:sz w:val="16"/>
+          <w:szCs w:val="16"/>
+        </w:rPr>
+        <w:tab/>
+      </w:r>
+      <w:r>
+        <w:rPr>
+          <w:rFonts w:ascii="Bookman Old Style" w:hAnsi="Bookman Old Style"/>
+          <w:sz w:val="16"/>
+          <w:szCs w:val="16"/>
+        </w:rPr>
+        <w:t>{POSITIONS_OF_CC_3}</w:t>
+      </w:r>
     </w:p>
     <w:p>
       <w:pPr>
         <w:pStyle w:val="NoSpacing"/>
         <w:rPr>
           <w:rFonts w:ascii="Bookman Old Style" w:hAnsi="Bookman Old Style"/>
-          <w:sz w:val="12"/>
-          <w:szCs w:val="12"/>
+          <w:sz w:val="16"/>
+          <w:szCs w:val="16"/>
         </w:rPr>
       </w:pPr>
     </w:p>
     <w:p>
       <w:pPr>
         <w:pStyle w:val="NoSpacing"/>
+        <w:ind w:firstLine="720"/>
         <w:rPr>
           <w:rFonts w:ascii="Bookman Old Style" w:hAnsi="Bookman Old Style"/>
-          <w:sz w:val="12"/>
-          <w:szCs w:val="12"/>
-        </w:rPr>
-      </w:pPr>
+          <w:sz w:val="16"/>
+          <w:szCs w:val="16"/>
+        </w:rPr>
+      </w:pPr>
+      <w:r>
+        <w:rPr>
+          <w:rFonts w:ascii="Bookman Old Style" w:hAnsi="Bookman Old Style"/>
+          <w:sz w:val="16"/>
+          <w:szCs w:val="16"/>
+        </w:rPr>
+        <w:t>{CC_4}</w:t>
+      </w:r>
+    </w:p>
+    <w:p>
+      <w:pPr>
+        <w:pStyle w:val="NoSpacing"/>
+        <w:rPr>
+          <w:rFonts w:ascii="Bookman Old Style" w:hAnsi="Bookman Old Style"/>
+          <w:sz w:val="16"/>
+          <w:szCs w:val="16"/>
+        </w:rPr>
+      </w:pPr>
+      <w:r>
+        <w:rPr>
+          <w:rFonts w:ascii="Bookman Old Style" w:hAnsi="Bookman Old Style"/>
+          <w:sz w:val="16"/>
+          <w:szCs w:val="16"/>
+        </w:rPr>
+        <w:tab/>
+      </w:r>
+      <w:r>
+        <w:rPr>
+          <w:rFonts w:ascii="Bookman Old Style" w:hAnsi="Bookman Old Style"/>
+          <w:sz w:val="16"/>
+          <w:szCs w:val="16"/>
+        </w:rPr>
+        <w:t>{POSITIONS_OF_CC_4}</w:t>
+      </w:r>
     </w:p>
     <w:p>
       <w:pPr>
@@ -776,6 +834,7 @@
 
 <file path=word/footer1.xml><?xml version="1.0" encoding="utf-8"?>
 <w:ftr xmlns:wpc="http://schemas.microsoft.com/office/word/2010/wordprocessingCanvas" xmlns:cx="http://schemas.microsoft.com/office/drawing/2014/chartex" xmlns:cx1="http://schemas.microsoft.com/office/drawing/2015/9/8/chartex" xmlns:cx2="http://schemas.microsoft.com/office/drawing/2015/10/21/chartex" xmlns:cx3="http://schemas.microsoft.com/office/drawing/2016/5/9/chartex" xmlns:cx4="http://schemas.microsoft.com/office/drawing/2016/5/10/chartex" xmlns:cx5="http://schemas.microsoft.com/office/drawing/2016/5/11/chartex" xmlns:cx6="http://schemas.microsoft.com/office/drawing/2016/5/12/chartex" xmlns:cx7="http://schemas.microsoft.com/office/drawing/2016/5/13/chartex" xmlns:cx8="http://schemas.microsoft.com/office/drawing/2016/5/14/chartex" xmlns:mc="http://schemas.openxmlformats.org/markup-compatibility/2006" xmlns:aink="http://schemas.microsoft.com/office/drawing/2016/ink" xmlns:am3d="http://schemas.microsoft.com/office/drawing/2017/model3d" xmlns:o="urn:schemas-microsoft-com:office:office" xmlns:oel="http://schemas.microsoft.com/office/2019/extlst" xmlns:r="http://schemas.openxmlformats.org/officeDocument/2006/relationships" xmlns:m="http://schemas.openxmlformats.org/officeDocument/2006/math" xmlns:v="urn:schemas-microsoft-com:vml" xmlns:wp14="http://schemas.microsoft.com/office/word/2010/wordprocessingDrawing" xmlns:wp="http://schemas.openxmlformats.org/drawingml/2006/wordprocessingDrawing" xmlns:w10="urn:schemas-microsoft-com:office:word" xmlns:w="http://schemas.openxmlformats.org/wordprocessingml/2006/main" xmlns:w14="http://schemas.microsoft.com/office/word/2010/wordml" xmlns:w15="http://schemas.microsoft.com/office/word/2012/wordml" xmlns:w16cex="http://schemas.microsoft.com/office/word/2018/wordml/cex" xmlns:w16cid="http://schemas.microsoft.com/office/word/2016/wordml/cid" xmlns:w16="http://schemas.microsoft.com/office/word/2018/wordml" xmlns:w16du="http://schemas.microsoft.com/office/word/2023/wordml/word16du" xmlns:w16sdtdh="http://schemas.microsoft.com/office/word/2020/wordml/sdtdatahash" xmlns:w16sdtfl="http://schemas.microsoft.com/office/word/2024/wordml/sdtformatlock" xmlns:w16se="http://schemas.microsoft.com/office/word/2015/wordml/symex" xmlns:wpg="http://schemas.microsoft.com/office/word/2010/wordprocessingGroup" xmlns:wpi="http://schemas.microsoft.com/office/word/2010/wordprocessingInk" xmlns:wne="http://schemas.microsoft.com/office/word/2006/wordml" xmlns:wps="http://schemas.microsoft.com/office/word/2010/wordprocessingShape" mc:Ignorable="w14 w15 w16se w16cid w16 w16cex w16sdtdh w16sdtfl w16du wp14">
+  <w:bookmarkStart w:id="1" w:name="_Hlk189835591"/>
   <w:p>
     <w:pPr>
       <w:rPr>
@@ -783,7 +842,6 @@
         <w14:ligatures w14:val="standardContextual"/>
       </w:rPr>
     </w:pPr>
-    <w:bookmarkStart w:id="1" w:name="_Hlk189835591"/>
     <w:r>
       <w:rPr>
         <w:noProof/>
@@ -1623,7 +1681,11 @@
         </mc:Choice>
         <mc:Fallback>
           <w:pict>
-            <v:shape w14:anchorId="098F1ADA" id="Text Box 3" o:spid="_x0000_s1027" type="#_x0000_t202" style="position:absolute;margin-left:222.5pt;margin-top:21.45pt;width:166.4pt;height:23.6pt;z-index:251665408;visibility:visible;mso-wrap-style:square;mso-width-percent:0;mso-height-percent:0;mso-wrap-distance-left:9pt;mso-wrap-distance-top:0;mso-wrap-distance-right:9pt;mso-wrap-distance-bottom:0;mso-position-horizontal:absolute;mso-position-horizontal-relative:text;mso-position-vertical:absolute;mso-position-vertical-relative:text;mso-width-percent:0;mso-height-percent:0;mso-width-relative:page;mso-height-relative:page;v-text-anchor:top" o:gfxdata="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" stroked="f">
+            <v:shapetype w14:anchorId="098F1ADA" id="_x0000_t202" coordsize="21600,21600" o:spt="202" path="m,l,21600r21600,l21600,xe">
+              <v:stroke joinstyle="miter"/>
+              <v:path gradientshapeok="t" o:connecttype="rect"/>
+            </v:shapetype>
+            <v:shape id="Text Box 3" o:spid="_x0000_s1027" type="#_x0000_t202" style="position:absolute;margin-left:222.5pt;margin-top:21.45pt;width:166.4pt;height:23.6pt;z-index:251665408;visibility:visible;mso-wrap-style:square;mso-width-percent:0;mso-height-percent:0;mso-wrap-distance-left:9pt;mso-wrap-distance-top:0;mso-wrap-distance-right:9pt;mso-wrap-distance-bottom:0;mso-position-horizontal:absolute;mso-position-horizontal-relative:text;mso-position-vertical:absolute;mso-position-vertical-relative:text;mso-width-percent:0;mso-height-percent:0;mso-width-relative:page;mso-height-relative:page;v-text-anchor:top" o:gfxdata="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" stroked="f">
               <v:textbox inset="1.44pt,0,0,0">
                 <w:txbxContent>
                   <w:tbl>

</xml_diff>

<commit_message>
feat: make email fields required and dynamically assign series year in orders
</commit_message>
<xml_diff>
--- a/rsp-dashboard/public/templates/Assignment Order - Division Office.docx
+++ b/rsp-dashboard/public/templates/Assignment Order - Division Office.docx
@@ -24,30 +24,21 @@
           <w:rFonts w:ascii="Bookman Old Style" w:hAnsi="Bookman Old Style" w:cs="Tahoma"/>
           <w:b/>
         </w:rPr>
-        <w:t>{</w:t>
-      </w:r>
-      <w:proofErr w:type="spellStart"/>
+        <w:t>{Assignment_Order_No}</w:t>
+      </w:r>
       <w:r>
         <w:rPr>
           <w:rFonts w:ascii="Bookman Old Style" w:hAnsi="Bookman Old Style" w:cs="Tahoma"/>
           <w:b/>
         </w:rPr>
-        <w:t>Assignment_Order_No</w:t>
-      </w:r>
-      <w:proofErr w:type="spellEnd"/>
+        <w:t xml:space="preserve">, s. </w:t>
+      </w:r>
       <w:r>
         <w:rPr>
           <w:rFonts w:ascii="Bookman Old Style" w:hAnsi="Bookman Old Style" w:cs="Tahoma"/>
           <w:b/>
         </w:rPr>
-        <w:t>}</w:t>
-      </w:r>
-      <w:r>
-        <w:rPr>
-          <w:rFonts w:ascii="Bookman Old Style" w:hAnsi="Bookman Old Style" w:cs="Tahoma"/>
-          <w:b/>
-        </w:rPr>
-        <w:t>, s. 2025</w:t>
+        <w:t>{{Assignment_Order_Year}}</w:t>
       </w:r>
       <w:r>
         <w:rPr>

</xml_diff>

<commit_message>
Fix seeding issues, doc generation bugs, and update documentation
</commit_message>
<xml_diff>
--- a/rsp-dashboard/public/templates/Assignment Order - Division Office.docx
+++ b/rsp-dashboard/public/templates/Assignment Order - Division Office.docx
@@ -38,7 +38,7 @@
           <w:rFonts w:ascii="Bookman Old Style" w:hAnsi="Bookman Old Style" w:cs="Tahoma"/>
           <w:b/>
         </w:rPr>
-        <w:t>{{Assignment_Order_Year}}</w:t>
+        <w:t>{Assignment_Order_Year}</w:t>
       </w:r>
       <w:r>
         <w:rPr>
@@ -189,7 +189,7 @@
           <w:rFonts w:ascii="Bookman Old Style" w:hAnsi="Bookman Old Style" w:cs="Nirmala UI"/>
           <w:b/>
         </w:rPr>
-        <w:t>{"COMPLETE_NAME"}</w:t>
+        <w:t>{COMPLETE_NAME}</w:t>
       </w:r>
     </w:p>
     <w:p>

</xml_diff>